<commit_message>
Add per-section flowchart diagrams to Distribution EPC document
Generate one flowchart PNG per workflow section (20 total) showing
sequential steps and highlighting parallel activities, then embed
each image into the Word document in place of the text placeholder,
matching the original Substation.docx's per-section embedded image
structure.

Co-Authored-By: Claude Sonnet 4.6 <noreply@anthropic.com>
Claude-Session: https://claude.ai/code/session_018v8twwNDLhKYK2n2HVYhb1
</commit_message>
<xml_diff>
--- a/Distribution_EPC_Workforce_Management.docx
+++ b/Distribution_EPC_Workforce_Management.docx
@@ -573,13 +573,44 @@
         </w:rPr>
         <w:t>Flowchart:</w:t>
       </w:r>
-      <w:r>
-        <w:rPr>
-          <w:rFonts w:ascii="Calibri" w:hAnsi="Calibri"/>
-          <w:b w:val="0"/>
-          <w:sz w:val="22"/>
-        </w:rPr>
-        <w:t xml:space="preserve">  [Flowchart to be inserted here]</w:t>
+    </w:p>
+    <w:p>
+      <w:pPr>
+        <w:jc w:val="center"/>
+      </w:pPr>
+      <w:r>
+        <w:drawing>
+          <wp:inline xmlns:a="http://schemas.openxmlformats.org/drawingml/2006/main" xmlns:pic="http://schemas.openxmlformats.org/drawingml/2006/picture">
+            <wp:extent cx="5486400" cy="11343823"/>
+            <wp:docPr id="1" name="Picture 1"/>
+            <wp:cNvGraphicFramePr>
+              <a:graphicFrameLocks noChangeAspect="1"/>
+            </wp:cNvGraphicFramePr>
+            <a:graphic>
+              <a:graphicData uri="http://schemas.openxmlformats.org/drawingml/2006/picture">
+                <pic:pic>
+                  <pic:nvPicPr>
+                    <pic:cNvPr id="0" name="section_01.png"/>
+                    <pic:cNvPicPr/>
+                  </pic:nvPicPr>
+                  <pic:blipFill>
+                    <a:blip r:embed="rId9"/>
+                    <a:stretch>
+                      <a:fillRect/>
+                    </a:stretch>
+                  </pic:blipFill>
+                  <pic:spPr>
+                    <a:xfrm>
+                      <a:off x="0" y="0"/>
+                      <a:ext cx="5486400" cy="11343823"/>
+                    </a:xfrm>
+                    <a:prstGeom prst="rect"/>
+                  </pic:spPr>
+                </pic:pic>
+              </a:graphicData>
+            </a:graphic>
+          </wp:inline>
+        </w:drawing>
       </w:r>
     </w:p>
     <w:p>
@@ -974,13 +1005,44 @@
         </w:rPr>
         <w:t>Flowchart:</w:t>
       </w:r>
-      <w:r>
-        <w:rPr>
-          <w:rFonts w:ascii="Calibri" w:hAnsi="Calibri"/>
-          <w:b w:val="0"/>
-          <w:sz w:val="22"/>
-        </w:rPr>
-        <w:t xml:space="preserve">  [Flowchart to be inserted here]</w:t>
+    </w:p>
+    <w:p>
+      <w:pPr>
+        <w:jc w:val="center"/>
+      </w:pPr>
+      <w:r>
+        <w:drawing>
+          <wp:inline xmlns:a="http://schemas.openxmlformats.org/drawingml/2006/main" xmlns:pic="http://schemas.openxmlformats.org/drawingml/2006/picture">
+            <wp:extent cx="5486400" cy="6083992"/>
+            <wp:docPr id="2" name="Picture 2"/>
+            <wp:cNvGraphicFramePr>
+              <a:graphicFrameLocks noChangeAspect="1"/>
+            </wp:cNvGraphicFramePr>
+            <a:graphic>
+              <a:graphicData uri="http://schemas.openxmlformats.org/drawingml/2006/picture">
+                <pic:pic>
+                  <pic:nvPicPr>
+                    <pic:cNvPr id="0" name="section_02.png"/>
+                    <pic:cNvPicPr/>
+                  </pic:nvPicPr>
+                  <pic:blipFill>
+                    <a:blip r:embed="rId10"/>
+                    <a:stretch>
+                      <a:fillRect/>
+                    </a:stretch>
+                  </pic:blipFill>
+                  <pic:spPr>
+                    <a:xfrm>
+                      <a:off x="0" y="0"/>
+                      <a:ext cx="5486400" cy="6083992"/>
+                    </a:xfrm>
+                    <a:prstGeom prst="rect"/>
+                  </pic:spPr>
+                </pic:pic>
+              </a:graphicData>
+            </a:graphic>
+          </wp:inline>
+        </w:drawing>
       </w:r>
     </w:p>
     <w:p>
@@ -1240,13 +1302,44 @@
         </w:rPr>
         <w:t>Flowchart:</w:t>
       </w:r>
-      <w:r>
-        <w:rPr>
-          <w:rFonts w:ascii="Calibri" w:hAnsi="Calibri"/>
-          <w:b w:val="0"/>
-          <w:sz w:val="22"/>
-        </w:rPr>
-        <w:t xml:space="preserve">  [Flowchart to be inserted here]</w:t>
+    </w:p>
+    <w:p>
+      <w:pPr>
+        <w:jc w:val="center"/>
+      </w:pPr>
+      <w:r>
+        <w:drawing>
+          <wp:inline xmlns:a="http://schemas.openxmlformats.org/drawingml/2006/main" xmlns:pic="http://schemas.openxmlformats.org/drawingml/2006/picture">
+            <wp:extent cx="5486400" cy="5014452"/>
+            <wp:docPr id="3" name="Picture 3"/>
+            <wp:cNvGraphicFramePr>
+              <a:graphicFrameLocks noChangeAspect="1"/>
+            </wp:cNvGraphicFramePr>
+            <a:graphic>
+              <a:graphicData uri="http://schemas.openxmlformats.org/drawingml/2006/picture">
+                <pic:pic>
+                  <pic:nvPicPr>
+                    <pic:cNvPr id="0" name="section_03.png"/>
+                    <pic:cNvPicPr/>
+                  </pic:nvPicPr>
+                  <pic:blipFill>
+                    <a:blip r:embed="rId11"/>
+                    <a:stretch>
+                      <a:fillRect/>
+                    </a:stretch>
+                  </pic:blipFill>
+                  <pic:spPr>
+                    <a:xfrm>
+                      <a:off x="0" y="0"/>
+                      <a:ext cx="5486400" cy="5014452"/>
+                    </a:xfrm>
+                    <a:prstGeom prst="rect"/>
+                  </pic:spPr>
+                </pic:pic>
+              </a:graphicData>
+            </a:graphic>
+          </wp:inline>
+        </w:drawing>
       </w:r>
     </w:p>
     <w:p>
@@ -1452,13 +1545,44 @@
         </w:rPr>
         <w:t>Flowchart:</w:t>
       </w:r>
-      <w:r>
-        <w:rPr>
-          <w:rFonts w:ascii="Calibri" w:hAnsi="Calibri"/>
-          <w:b w:val="0"/>
-          <w:sz w:val="22"/>
-        </w:rPr>
-        <w:t xml:space="preserve">  [Flowchart to be inserted here]</w:t>
+    </w:p>
+    <w:p>
+      <w:pPr>
+        <w:jc w:val="center"/>
+      </w:pPr>
+      <w:r>
+        <w:drawing>
+          <wp:inline xmlns:a="http://schemas.openxmlformats.org/drawingml/2006/main" xmlns:pic="http://schemas.openxmlformats.org/drawingml/2006/picture">
+            <wp:extent cx="5486400" cy="6056142"/>
+            <wp:docPr id="4" name="Picture 4"/>
+            <wp:cNvGraphicFramePr>
+              <a:graphicFrameLocks noChangeAspect="1"/>
+            </wp:cNvGraphicFramePr>
+            <a:graphic>
+              <a:graphicData uri="http://schemas.openxmlformats.org/drawingml/2006/picture">
+                <pic:pic>
+                  <pic:nvPicPr>
+                    <pic:cNvPr id="0" name="section_04.png"/>
+                    <pic:cNvPicPr/>
+                  </pic:nvPicPr>
+                  <pic:blipFill>
+                    <a:blip r:embed="rId12"/>
+                    <a:stretch>
+                      <a:fillRect/>
+                    </a:stretch>
+                  </pic:blipFill>
+                  <pic:spPr>
+                    <a:xfrm>
+                      <a:off x="0" y="0"/>
+                      <a:ext cx="5486400" cy="6056142"/>
+                    </a:xfrm>
+                    <a:prstGeom prst="rect"/>
+                  </pic:spPr>
+                </pic:pic>
+              </a:graphicData>
+            </a:graphic>
+          </wp:inline>
+        </w:drawing>
       </w:r>
     </w:p>
     <w:p>
@@ -1691,13 +1815,44 @@
         </w:rPr>
         <w:t>Flowchart:</w:t>
       </w:r>
-      <w:r>
-        <w:rPr>
-          <w:rFonts w:ascii="Calibri" w:hAnsi="Calibri"/>
-          <w:b w:val="0"/>
-          <w:sz w:val="22"/>
-        </w:rPr>
-        <w:t xml:space="preserve">  [Flowchart to be inserted here]</w:t>
+    </w:p>
+    <w:p>
+      <w:pPr>
+        <w:jc w:val="center"/>
+      </w:pPr>
+      <w:r>
+        <w:drawing>
+          <wp:inline xmlns:a="http://schemas.openxmlformats.org/drawingml/2006/main" xmlns:pic="http://schemas.openxmlformats.org/drawingml/2006/picture">
+            <wp:extent cx="5486400" cy="6014301"/>
+            <wp:docPr id="5" name="Picture 5"/>
+            <wp:cNvGraphicFramePr>
+              <a:graphicFrameLocks noChangeAspect="1"/>
+            </wp:cNvGraphicFramePr>
+            <a:graphic>
+              <a:graphicData uri="http://schemas.openxmlformats.org/drawingml/2006/picture">
+                <pic:pic>
+                  <pic:nvPicPr>
+                    <pic:cNvPr id="0" name="section_05.png"/>
+                    <pic:cNvPicPr/>
+                  </pic:nvPicPr>
+                  <pic:blipFill>
+                    <a:blip r:embed="rId13"/>
+                    <a:stretch>
+                      <a:fillRect/>
+                    </a:stretch>
+                  </pic:blipFill>
+                  <pic:spPr>
+                    <a:xfrm>
+                      <a:off x="0" y="0"/>
+                      <a:ext cx="5486400" cy="6014301"/>
+                    </a:xfrm>
+                    <a:prstGeom prst="rect"/>
+                  </pic:spPr>
+                </pic:pic>
+              </a:graphicData>
+            </a:graphic>
+          </wp:inline>
+        </w:drawing>
       </w:r>
     </w:p>
     <w:p>
@@ -1957,13 +2112,44 @@
         </w:rPr>
         <w:t>Flowchart:</w:t>
       </w:r>
-      <w:r>
-        <w:rPr>
-          <w:rFonts w:ascii="Calibri" w:hAnsi="Calibri"/>
-          <w:b w:val="0"/>
-          <w:sz w:val="22"/>
-        </w:rPr>
-        <w:t xml:space="preserve">  [Flowchart to be inserted here]</w:t>
+    </w:p>
+    <w:p>
+      <w:pPr>
+        <w:jc w:val="center"/>
+      </w:pPr>
+      <w:r>
+        <w:drawing>
+          <wp:inline xmlns:a="http://schemas.openxmlformats.org/drawingml/2006/main" xmlns:pic="http://schemas.openxmlformats.org/drawingml/2006/picture">
+            <wp:extent cx="5486400" cy="5627529"/>
+            <wp:docPr id="6" name="Picture 6"/>
+            <wp:cNvGraphicFramePr>
+              <a:graphicFrameLocks noChangeAspect="1"/>
+            </wp:cNvGraphicFramePr>
+            <a:graphic>
+              <a:graphicData uri="http://schemas.openxmlformats.org/drawingml/2006/picture">
+                <pic:pic>
+                  <pic:nvPicPr>
+                    <pic:cNvPr id="0" name="section_06.png"/>
+                    <pic:cNvPicPr/>
+                  </pic:nvPicPr>
+                  <pic:blipFill>
+                    <a:blip r:embed="rId14"/>
+                    <a:stretch>
+                      <a:fillRect/>
+                    </a:stretch>
+                  </pic:blipFill>
+                  <pic:spPr>
+                    <a:xfrm>
+                      <a:off x="0" y="0"/>
+                      <a:ext cx="5486400" cy="5627529"/>
+                    </a:xfrm>
+                    <a:prstGeom prst="rect"/>
+                  </pic:spPr>
+                </pic:pic>
+              </a:graphicData>
+            </a:graphic>
+          </wp:inline>
+        </w:drawing>
       </w:r>
     </w:p>
     <w:p>
@@ -2223,13 +2409,44 @@
         </w:rPr>
         <w:t>Flowchart:</w:t>
       </w:r>
-      <w:r>
-        <w:rPr>
-          <w:rFonts w:ascii="Calibri" w:hAnsi="Calibri"/>
-          <w:b w:val="0"/>
-          <w:sz w:val="22"/>
-        </w:rPr>
-        <w:t xml:space="preserve">  [Flowchart to be inserted here]</w:t>
+    </w:p>
+    <w:p>
+      <w:pPr>
+        <w:jc w:val="center"/>
+      </w:pPr>
+      <w:r>
+        <w:drawing>
+          <wp:inline xmlns:a="http://schemas.openxmlformats.org/drawingml/2006/main" xmlns:pic="http://schemas.openxmlformats.org/drawingml/2006/picture">
+            <wp:extent cx="5486400" cy="5004015"/>
+            <wp:docPr id="7" name="Picture 7"/>
+            <wp:cNvGraphicFramePr>
+              <a:graphicFrameLocks noChangeAspect="1"/>
+            </wp:cNvGraphicFramePr>
+            <a:graphic>
+              <a:graphicData uri="http://schemas.openxmlformats.org/drawingml/2006/picture">
+                <pic:pic>
+                  <pic:nvPicPr>
+                    <pic:cNvPr id="0" name="section_07.png"/>
+                    <pic:cNvPicPr/>
+                  </pic:nvPicPr>
+                  <pic:blipFill>
+                    <a:blip r:embed="rId15"/>
+                    <a:stretch>
+                      <a:fillRect/>
+                    </a:stretch>
+                  </pic:blipFill>
+                  <pic:spPr>
+                    <a:xfrm>
+                      <a:off x="0" y="0"/>
+                      <a:ext cx="5486400" cy="5004015"/>
+                    </a:xfrm>
+                    <a:prstGeom prst="rect"/>
+                  </pic:spPr>
+                </pic:pic>
+              </a:graphicData>
+            </a:graphic>
+          </wp:inline>
+        </w:drawing>
       </w:r>
     </w:p>
     <w:p>
@@ -2462,13 +2679,44 @@
         </w:rPr>
         <w:t>Flowchart:</w:t>
       </w:r>
-      <w:r>
-        <w:rPr>
-          <w:rFonts w:ascii="Calibri" w:hAnsi="Calibri"/>
-          <w:b w:val="0"/>
-          <w:sz w:val="22"/>
-        </w:rPr>
-        <w:t xml:space="preserve">  [Flowchart to be inserted here]</w:t>
+    </w:p>
+    <w:p>
+      <w:pPr>
+        <w:jc w:val="center"/>
+      </w:pPr>
+      <w:r>
+        <w:drawing>
+          <wp:inline xmlns:a="http://schemas.openxmlformats.org/drawingml/2006/main" xmlns:pic="http://schemas.openxmlformats.org/drawingml/2006/picture">
+            <wp:extent cx="5486400" cy="5611091"/>
+            <wp:docPr id="8" name="Picture 8"/>
+            <wp:cNvGraphicFramePr>
+              <a:graphicFrameLocks noChangeAspect="1"/>
+            </wp:cNvGraphicFramePr>
+            <a:graphic>
+              <a:graphicData uri="http://schemas.openxmlformats.org/drawingml/2006/picture">
+                <pic:pic>
+                  <pic:nvPicPr>
+                    <pic:cNvPr id="0" name="section_08.png"/>
+                    <pic:cNvPicPr/>
+                  </pic:nvPicPr>
+                  <pic:blipFill>
+                    <a:blip r:embed="rId16"/>
+                    <a:stretch>
+                      <a:fillRect/>
+                    </a:stretch>
+                  </pic:blipFill>
+                  <pic:spPr>
+                    <a:xfrm>
+                      <a:off x="0" y="0"/>
+                      <a:ext cx="5486400" cy="5611091"/>
+                    </a:xfrm>
+                    <a:prstGeom prst="rect"/>
+                  </pic:spPr>
+                </pic:pic>
+              </a:graphicData>
+            </a:graphic>
+          </wp:inline>
+        </w:drawing>
       </w:r>
     </w:p>
     <w:p>
@@ -2674,13 +2922,44 @@
         </w:rPr>
         <w:t>Flowchart:</w:t>
       </w:r>
-      <w:r>
-        <w:rPr>
-          <w:rFonts w:ascii="Calibri" w:hAnsi="Calibri"/>
-          <w:b w:val="0"/>
-          <w:sz w:val="22"/>
-        </w:rPr>
-        <w:t xml:space="preserve">  [Flowchart to be inserted here]</w:t>
+    </w:p>
+    <w:p>
+      <w:pPr>
+        <w:jc w:val="center"/>
+      </w:pPr>
+      <w:r>
+        <w:drawing>
+          <wp:inline xmlns:a="http://schemas.openxmlformats.org/drawingml/2006/main" xmlns:pic="http://schemas.openxmlformats.org/drawingml/2006/picture">
+            <wp:extent cx="5486400" cy="6041985"/>
+            <wp:docPr id="9" name="Picture 9"/>
+            <wp:cNvGraphicFramePr>
+              <a:graphicFrameLocks noChangeAspect="1"/>
+            </wp:cNvGraphicFramePr>
+            <a:graphic>
+              <a:graphicData uri="http://schemas.openxmlformats.org/drawingml/2006/picture">
+                <pic:pic>
+                  <pic:nvPicPr>
+                    <pic:cNvPr id="0" name="section_09.png"/>
+                    <pic:cNvPicPr/>
+                  </pic:nvPicPr>
+                  <pic:blipFill>
+                    <a:blip r:embed="rId17"/>
+                    <a:stretch>
+                      <a:fillRect/>
+                    </a:stretch>
+                  </pic:blipFill>
+                  <pic:spPr>
+                    <a:xfrm>
+                      <a:off x="0" y="0"/>
+                      <a:ext cx="5486400" cy="6041985"/>
+                    </a:xfrm>
+                    <a:prstGeom prst="rect"/>
+                  </pic:spPr>
+                </pic:pic>
+              </a:graphicData>
+            </a:graphic>
+          </wp:inline>
+        </w:drawing>
       </w:r>
     </w:p>
     <w:p>
@@ -2940,13 +3219,44 @@
         </w:rPr>
         <w:t>Flowchart:</w:t>
       </w:r>
-      <w:r>
-        <w:rPr>
-          <w:rFonts w:ascii="Calibri" w:hAnsi="Calibri"/>
-          <w:b w:val="0"/>
-          <w:sz w:val="22"/>
-        </w:rPr>
-        <w:t xml:space="preserve">  [Flowchart to be inserted here]</w:t>
+    </w:p>
+    <w:p>
+      <w:pPr>
+        <w:jc w:val="center"/>
+      </w:pPr>
+      <w:r>
+        <w:drawing>
+          <wp:inline xmlns:a="http://schemas.openxmlformats.org/drawingml/2006/main" xmlns:pic="http://schemas.openxmlformats.org/drawingml/2006/picture">
+            <wp:extent cx="5486400" cy="6801146"/>
+            <wp:docPr id="10" name="Picture 10"/>
+            <wp:cNvGraphicFramePr>
+              <a:graphicFrameLocks noChangeAspect="1"/>
+            </wp:cNvGraphicFramePr>
+            <a:graphic>
+              <a:graphicData uri="http://schemas.openxmlformats.org/drawingml/2006/picture">
+                <pic:pic>
+                  <pic:nvPicPr>
+                    <pic:cNvPr id="0" name="section_10.png"/>
+                    <pic:cNvPicPr/>
+                  </pic:nvPicPr>
+                  <pic:blipFill>
+                    <a:blip r:embed="rId18"/>
+                    <a:stretch>
+                      <a:fillRect/>
+                    </a:stretch>
+                  </pic:blipFill>
+                  <pic:spPr>
+                    <a:xfrm>
+                      <a:off x="0" y="0"/>
+                      <a:ext cx="5486400" cy="6801146"/>
+                    </a:xfrm>
+                    <a:prstGeom prst="rect"/>
+                  </pic:spPr>
+                </pic:pic>
+              </a:graphicData>
+            </a:graphic>
+          </wp:inline>
+        </w:drawing>
       </w:r>
     </w:p>
     <w:p>
@@ -3206,13 +3516,44 @@
         </w:rPr>
         <w:t>Flowchart:</w:t>
       </w:r>
-      <w:r>
-        <w:rPr>
-          <w:rFonts w:ascii="Calibri" w:hAnsi="Calibri"/>
-          <w:b w:val="0"/>
-          <w:sz w:val="22"/>
-        </w:rPr>
-        <w:t xml:space="preserve">  [Flowchart to be inserted here]</w:t>
+    </w:p>
+    <w:p>
+      <w:pPr>
+        <w:jc w:val="center"/>
+      </w:pPr>
+      <w:r>
+        <w:drawing>
+          <wp:inline xmlns:a="http://schemas.openxmlformats.org/drawingml/2006/main" xmlns:pic="http://schemas.openxmlformats.org/drawingml/2006/picture">
+            <wp:extent cx="5486400" cy="6804687"/>
+            <wp:docPr id="11" name="Picture 11"/>
+            <wp:cNvGraphicFramePr>
+              <a:graphicFrameLocks noChangeAspect="1"/>
+            </wp:cNvGraphicFramePr>
+            <a:graphic>
+              <a:graphicData uri="http://schemas.openxmlformats.org/drawingml/2006/picture">
+                <pic:pic>
+                  <pic:nvPicPr>
+                    <pic:cNvPr id="0" name="section_11.png"/>
+                    <pic:cNvPicPr/>
+                  </pic:nvPicPr>
+                  <pic:blipFill>
+                    <a:blip r:embed="rId19"/>
+                    <a:stretch>
+                      <a:fillRect/>
+                    </a:stretch>
+                  </pic:blipFill>
+                  <pic:spPr>
+                    <a:xfrm>
+                      <a:off x="0" y="0"/>
+                      <a:ext cx="5486400" cy="6804687"/>
+                    </a:xfrm>
+                    <a:prstGeom prst="rect"/>
+                  </pic:spPr>
+                </pic:pic>
+              </a:graphicData>
+            </a:graphic>
+          </wp:inline>
+        </w:drawing>
       </w:r>
     </w:p>
     <w:p>
@@ -3499,13 +3840,44 @@
         </w:rPr>
         <w:t>Flowchart:</w:t>
       </w:r>
-      <w:r>
-        <w:rPr>
-          <w:rFonts w:ascii="Calibri" w:hAnsi="Calibri"/>
-          <w:b w:val="0"/>
-          <w:sz w:val="22"/>
-        </w:rPr>
-        <w:t xml:space="preserve">  [Flowchart to be inserted here]</w:t>
+    </w:p>
+    <w:p>
+      <w:pPr>
+        <w:jc w:val="center"/>
+      </w:pPr>
+      <w:r>
+        <w:drawing>
+          <wp:inline xmlns:a="http://schemas.openxmlformats.org/drawingml/2006/main" xmlns:pic="http://schemas.openxmlformats.org/drawingml/2006/picture">
+            <wp:extent cx="5486400" cy="6379690"/>
+            <wp:docPr id="12" name="Picture 12"/>
+            <wp:cNvGraphicFramePr>
+              <a:graphicFrameLocks noChangeAspect="1"/>
+            </wp:cNvGraphicFramePr>
+            <a:graphic>
+              <a:graphicData uri="http://schemas.openxmlformats.org/drawingml/2006/picture">
+                <pic:pic>
+                  <pic:nvPicPr>
+                    <pic:cNvPr id="0" name="section_12.png"/>
+                    <pic:cNvPicPr/>
+                  </pic:nvPicPr>
+                  <pic:blipFill>
+                    <a:blip r:embed="rId20"/>
+                    <a:stretch>
+                      <a:fillRect/>
+                    </a:stretch>
+                  </pic:blipFill>
+                  <pic:spPr>
+                    <a:xfrm>
+                      <a:off x="0" y="0"/>
+                      <a:ext cx="5486400" cy="6379690"/>
+                    </a:xfrm>
+                    <a:prstGeom prst="rect"/>
+                  </pic:spPr>
+                </pic:pic>
+              </a:graphicData>
+            </a:graphic>
+          </wp:inline>
+        </w:drawing>
       </w:r>
     </w:p>
     <w:p>
@@ -3765,13 +4137,44 @@
         </w:rPr>
         <w:t>Flowchart:</w:t>
       </w:r>
-      <w:r>
-        <w:rPr>
-          <w:rFonts w:ascii="Calibri" w:hAnsi="Calibri"/>
-          <w:b w:val="0"/>
-          <w:sz w:val="22"/>
-        </w:rPr>
-        <w:t xml:space="preserve">  [Flowchart to be inserted here]</w:t>
+    </w:p>
+    <w:p>
+      <w:pPr>
+        <w:jc w:val="center"/>
+      </w:pPr>
+      <w:r>
+        <w:drawing>
+          <wp:inline xmlns:a="http://schemas.openxmlformats.org/drawingml/2006/main" xmlns:pic="http://schemas.openxmlformats.org/drawingml/2006/picture">
+            <wp:extent cx="5486400" cy="6965606"/>
+            <wp:docPr id="13" name="Picture 13"/>
+            <wp:cNvGraphicFramePr>
+              <a:graphicFrameLocks noChangeAspect="1"/>
+            </wp:cNvGraphicFramePr>
+            <a:graphic>
+              <a:graphicData uri="http://schemas.openxmlformats.org/drawingml/2006/picture">
+                <pic:pic>
+                  <pic:nvPicPr>
+                    <pic:cNvPr id="0" name="section_13.png"/>
+                    <pic:cNvPicPr/>
+                  </pic:nvPicPr>
+                  <pic:blipFill>
+                    <a:blip r:embed="rId21"/>
+                    <a:stretch>
+                      <a:fillRect/>
+                    </a:stretch>
+                  </pic:blipFill>
+                  <pic:spPr>
+                    <a:xfrm>
+                      <a:off x="0" y="0"/>
+                      <a:ext cx="5486400" cy="6965606"/>
+                    </a:xfrm>
+                    <a:prstGeom prst="rect"/>
+                  </pic:spPr>
+                </pic:pic>
+              </a:graphicData>
+            </a:graphic>
+          </wp:inline>
+        </w:drawing>
       </w:r>
     </w:p>
     <w:p>
@@ -4085,13 +4488,44 @@
         </w:rPr>
         <w:t>Flowchart:</w:t>
       </w:r>
-      <w:r>
-        <w:rPr>
-          <w:rFonts w:ascii="Calibri" w:hAnsi="Calibri"/>
-          <w:b w:val="0"/>
-          <w:sz w:val="22"/>
-        </w:rPr>
-        <w:t xml:space="preserve">  [Flowchart to be inserted here]</w:t>
+    </w:p>
+    <w:p>
+      <w:pPr>
+        <w:jc w:val="center"/>
+      </w:pPr>
+      <w:r>
+        <w:drawing>
+          <wp:inline xmlns:a="http://schemas.openxmlformats.org/drawingml/2006/main" xmlns:pic="http://schemas.openxmlformats.org/drawingml/2006/picture">
+            <wp:extent cx="5486400" cy="7622580"/>
+            <wp:docPr id="14" name="Picture 14"/>
+            <wp:cNvGraphicFramePr>
+              <a:graphicFrameLocks noChangeAspect="1"/>
+            </wp:cNvGraphicFramePr>
+            <a:graphic>
+              <a:graphicData uri="http://schemas.openxmlformats.org/drawingml/2006/picture">
+                <pic:pic>
+                  <pic:nvPicPr>
+                    <pic:cNvPr id="0" name="section_14.png"/>
+                    <pic:cNvPicPr/>
+                  </pic:nvPicPr>
+                  <pic:blipFill>
+                    <a:blip r:embed="rId22"/>
+                    <a:stretch>
+                      <a:fillRect/>
+                    </a:stretch>
+                  </pic:blipFill>
+                  <pic:spPr>
+                    <a:xfrm>
+                      <a:off x="0" y="0"/>
+                      <a:ext cx="5486400" cy="7622580"/>
+                    </a:xfrm>
+                    <a:prstGeom prst="rect"/>
+                  </pic:spPr>
+                </pic:pic>
+              </a:graphicData>
+            </a:graphic>
+          </wp:inline>
+        </w:drawing>
       </w:r>
     </w:p>
     <w:p>
@@ -4405,13 +4839,44 @@
         </w:rPr>
         <w:t>Flowchart:</w:t>
       </w:r>
-      <w:r>
-        <w:rPr>
-          <w:rFonts w:ascii="Calibri" w:hAnsi="Calibri"/>
-          <w:b w:val="0"/>
-          <w:sz w:val="22"/>
-        </w:rPr>
-        <w:t xml:space="preserve">  [Flowchart to be inserted here]</w:t>
+    </w:p>
+    <w:p>
+      <w:pPr>
+        <w:jc w:val="center"/>
+      </w:pPr>
+      <w:r>
+        <w:drawing>
+          <wp:inline xmlns:a="http://schemas.openxmlformats.org/drawingml/2006/main" xmlns:pic="http://schemas.openxmlformats.org/drawingml/2006/picture">
+            <wp:extent cx="5486400" cy="4133335"/>
+            <wp:docPr id="15" name="Picture 15"/>
+            <wp:cNvGraphicFramePr>
+              <a:graphicFrameLocks noChangeAspect="1"/>
+            </wp:cNvGraphicFramePr>
+            <a:graphic>
+              <a:graphicData uri="http://schemas.openxmlformats.org/drawingml/2006/picture">
+                <pic:pic>
+                  <pic:nvPicPr>
+                    <pic:cNvPr id="0" name="section_15.png"/>
+                    <pic:cNvPicPr/>
+                  </pic:nvPicPr>
+                  <pic:blipFill>
+                    <a:blip r:embed="rId23"/>
+                    <a:stretch>
+                      <a:fillRect/>
+                    </a:stretch>
+                  </pic:blipFill>
+                  <pic:spPr>
+                    <a:xfrm>
+                      <a:off x="0" y="0"/>
+                      <a:ext cx="5486400" cy="4133335"/>
+                    </a:xfrm>
+                    <a:prstGeom prst="rect"/>
+                  </pic:spPr>
+                </pic:pic>
+              </a:graphicData>
+            </a:graphic>
+          </wp:inline>
+        </w:drawing>
       </w:r>
     </w:p>
     <w:p>
@@ -4590,13 +5055,44 @@
         </w:rPr>
         <w:t>Flowchart:</w:t>
       </w:r>
-      <w:r>
-        <w:rPr>
-          <w:rFonts w:ascii="Calibri" w:hAnsi="Calibri"/>
-          <w:b w:val="0"/>
-          <w:sz w:val="22"/>
-        </w:rPr>
-        <w:t xml:space="preserve">  [Flowchart to be inserted here]</w:t>
+    </w:p>
+    <w:p>
+      <w:pPr>
+        <w:jc w:val="center"/>
+      </w:pPr>
+      <w:r>
+        <w:drawing>
+          <wp:inline xmlns:a="http://schemas.openxmlformats.org/drawingml/2006/main" xmlns:pic="http://schemas.openxmlformats.org/drawingml/2006/picture">
+            <wp:extent cx="5486400" cy="6533597"/>
+            <wp:docPr id="16" name="Picture 16"/>
+            <wp:cNvGraphicFramePr>
+              <a:graphicFrameLocks noChangeAspect="1"/>
+            </wp:cNvGraphicFramePr>
+            <a:graphic>
+              <a:graphicData uri="http://schemas.openxmlformats.org/drawingml/2006/picture">
+                <pic:pic>
+                  <pic:nvPicPr>
+                    <pic:cNvPr id="0" name="section_16.png"/>
+                    <pic:cNvPicPr/>
+                  </pic:nvPicPr>
+                  <pic:blipFill>
+                    <a:blip r:embed="rId24"/>
+                    <a:stretch>
+                      <a:fillRect/>
+                    </a:stretch>
+                  </pic:blipFill>
+                  <pic:spPr>
+                    <a:xfrm>
+                      <a:off x="0" y="0"/>
+                      <a:ext cx="5486400" cy="6533597"/>
+                    </a:xfrm>
+                    <a:prstGeom prst="rect"/>
+                  </pic:spPr>
+                </pic:pic>
+              </a:graphicData>
+            </a:graphic>
+          </wp:inline>
+        </w:drawing>
       </w:r>
     </w:p>
     <w:p>
@@ -4829,13 +5325,44 @@
         </w:rPr>
         <w:t>Flowchart:</w:t>
       </w:r>
-      <w:r>
-        <w:rPr>
-          <w:rFonts w:ascii="Calibri" w:hAnsi="Calibri"/>
-          <w:b w:val="0"/>
-          <w:sz w:val="22"/>
-        </w:rPr>
-        <w:t xml:space="preserve">  [Flowchart to be inserted here]</w:t>
+    </w:p>
+    <w:p>
+      <w:pPr>
+        <w:jc w:val="center"/>
+      </w:pPr>
+      <w:r>
+        <w:drawing>
+          <wp:inline xmlns:a="http://schemas.openxmlformats.org/drawingml/2006/main" xmlns:pic="http://schemas.openxmlformats.org/drawingml/2006/picture">
+            <wp:extent cx="5486400" cy="6002275"/>
+            <wp:docPr id="17" name="Picture 17"/>
+            <wp:cNvGraphicFramePr>
+              <a:graphicFrameLocks noChangeAspect="1"/>
+            </wp:cNvGraphicFramePr>
+            <a:graphic>
+              <a:graphicData uri="http://schemas.openxmlformats.org/drawingml/2006/picture">
+                <pic:pic>
+                  <pic:nvPicPr>
+                    <pic:cNvPr id="0" name="section_17.png"/>
+                    <pic:cNvPicPr/>
+                  </pic:nvPicPr>
+                  <pic:blipFill>
+                    <a:blip r:embed="rId25"/>
+                    <a:stretch>
+                      <a:fillRect/>
+                    </a:stretch>
+                  </pic:blipFill>
+                  <pic:spPr>
+                    <a:xfrm>
+                      <a:off x="0" y="0"/>
+                      <a:ext cx="5486400" cy="6002275"/>
+                    </a:xfrm>
+                    <a:prstGeom prst="rect"/>
+                  </pic:spPr>
+                </pic:pic>
+              </a:graphicData>
+            </a:graphic>
+          </wp:inline>
+        </w:drawing>
       </w:r>
     </w:p>
     <w:p>
@@ -5068,13 +5595,44 @@
         </w:rPr>
         <w:t>Flowchart:</w:t>
       </w:r>
-      <w:r>
-        <w:rPr>
-          <w:rFonts w:ascii="Calibri" w:hAnsi="Calibri"/>
-          <w:b w:val="0"/>
-          <w:sz w:val="22"/>
-        </w:rPr>
-        <w:t xml:space="preserve">  [Flowchart to be inserted here]</w:t>
+    </w:p>
+    <w:p>
+      <w:pPr>
+        <w:jc w:val="center"/>
+      </w:pPr>
+      <w:r>
+        <w:drawing>
+          <wp:inline xmlns:a="http://schemas.openxmlformats.org/drawingml/2006/main" xmlns:pic="http://schemas.openxmlformats.org/drawingml/2006/picture">
+            <wp:extent cx="5486400" cy="5810320"/>
+            <wp:docPr id="18" name="Picture 18"/>
+            <wp:cNvGraphicFramePr>
+              <a:graphicFrameLocks noChangeAspect="1"/>
+            </wp:cNvGraphicFramePr>
+            <a:graphic>
+              <a:graphicData uri="http://schemas.openxmlformats.org/drawingml/2006/picture">
+                <pic:pic>
+                  <pic:nvPicPr>
+                    <pic:cNvPr id="0" name="section_18.png"/>
+                    <pic:cNvPicPr/>
+                  </pic:nvPicPr>
+                  <pic:blipFill>
+                    <a:blip r:embed="rId26"/>
+                    <a:stretch>
+                      <a:fillRect/>
+                    </a:stretch>
+                  </pic:blipFill>
+                  <pic:spPr>
+                    <a:xfrm>
+                      <a:off x="0" y="0"/>
+                      <a:ext cx="5486400" cy="5810320"/>
+                    </a:xfrm>
+                    <a:prstGeom prst="rect"/>
+                  </pic:spPr>
+                </pic:pic>
+              </a:graphicData>
+            </a:graphic>
+          </wp:inline>
+        </w:drawing>
       </w:r>
     </w:p>
     <w:p>
@@ -5307,13 +5865,44 @@
         </w:rPr>
         <w:t>Flowchart:</w:t>
       </w:r>
-      <w:r>
-        <w:rPr>
-          <w:rFonts w:ascii="Calibri" w:hAnsi="Calibri"/>
-          <w:b w:val="0"/>
-          <w:sz w:val="22"/>
-        </w:rPr>
-        <w:t xml:space="preserve">  [Flowchart to be inserted here]</w:t>
+    </w:p>
+    <w:p>
+      <w:pPr>
+        <w:jc w:val="center"/>
+      </w:pPr>
+      <w:r>
+        <w:drawing>
+          <wp:inline xmlns:a="http://schemas.openxmlformats.org/drawingml/2006/main" xmlns:pic="http://schemas.openxmlformats.org/drawingml/2006/picture">
+            <wp:extent cx="5486400" cy="4030538"/>
+            <wp:docPr id="19" name="Picture 19"/>
+            <wp:cNvGraphicFramePr>
+              <a:graphicFrameLocks noChangeAspect="1"/>
+            </wp:cNvGraphicFramePr>
+            <a:graphic>
+              <a:graphicData uri="http://schemas.openxmlformats.org/drawingml/2006/picture">
+                <pic:pic>
+                  <pic:nvPicPr>
+                    <pic:cNvPr id="0" name="section_19.png"/>
+                    <pic:cNvPicPr/>
+                  </pic:nvPicPr>
+                  <pic:blipFill>
+                    <a:blip r:embed="rId27"/>
+                    <a:stretch>
+                      <a:fillRect/>
+                    </a:stretch>
+                  </pic:blipFill>
+                  <pic:spPr>
+                    <a:xfrm>
+                      <a:off x="0" y="0"/>
+                      <a:ext cx="5486400" cy="4030538"/>
+                    </a:xfrm>
+                    <a:prstGeom prst="rect"/>
+                  </pic:spPr>
+                </pic:pic>
+              </a:graphicData>
+            </a:graphic>
+          </wp:inline>
+        </w:drawing>
       </w:r>
     </w:p>
     <w:p>
@@ -5546,13 +6135,44 @@
         </w:rPr>
         <w:t>Flowchart:</w:t>
       </w:r>
-      <w:r>
-        <w:rPr>
-          <w:rFonts w:ascii="Calibri" w:hAnsi="Calibri"/>
-          <w:b w:val="0"/>
-          <w:sz w:val="22"/>
-        </w:rPr>
-        <w:t xml:space="preserve">  [Flowchart to be inserted here]</w:t>
+    </w:p>
+    <w:p>
+      <w:pPr>
+        <w:jc w:val="center"/>
+      </w:pPr>
+      <w:r>
+        <w:drawing>
+          <wp:inline xmlns:a="http://schemas.openxmlformats.org/drawingml/2006/main" xmlns:pic="http://schemas.openxmlformats.org/drawingml/2006/picture">
+            <wp:extent cx="5486400" cy="4140044"/>
+            <wp:docPr id="20" name="Picture 20"/>
+            <wp:cNvGraphicFramePr>
+              <a:graphicFrameLocks noChangeAspect="1"/>
+            </wp:cNvGraphicFramePr>
+            <a:graphic>
+              <a:graphicData uri="http://schemas.openxmlformats.org/drawingml/2006/picture">
+                <pic:pic>
+                  <pic:nvPicPr>
+                    <pic:cNvPr id="0" name="section_20.png"/>
+                    <pic:cNvPicPr/>
+                  </pic:nvPicPr>
+                  <pic:blipFill>
+                    <a:blip r:embed="rId28"/>
+                    <a:stretch>
+                      <a:fillRect/>
+                    </a:stretch>
+                  </pic:blipFill>
+                  <pic:spPr>
+                    <a:xfrm>
+                      <a:off x="0" y="0"/>
+                      <a:ext cx="5486400" cy="4140044"/>
+                    </a:xfrm>
+                    <a:prstGeom prst="rect"/>
+                  </pic:spPr>
+                </pic:pic>
+              </a:graphicData>
+            </a:graphic>
+          </wp:inline>
+        </w:drawing>
       </w:r>
     </w:p>
     <w:p>

</xml_diff>